<commit_message>
Added basic document generation
</commit_message>
<xml_diff>
--- a/public/Фунтикова Евгения Александровна.docx
+++ b/public/Фунтикова Евгения Александровна.docx
@@ -268,12 +268,14 @@
             <w:pPr>
               <w:jc w:val="center"/>
             </w:pPr>
+            <w:proofErr w:type="spellStart"/>
             <w:r>
               <w:rPr>
                 <w:sz w:val="16"/>
               </w:rPr>
               <w:t>Пн</w:t>
             </w:r>
+            <w:proofErr w:type="spellEnd"/>
           </w:p>
         </w:tc>
         <w:tc>
@@ -458,25 +460,7 @@
                 <w:sz w:val="16"/>
                 <w:lang w:val="ru-RU"/>
               </w:rPr>
-              <w:t>Б-306 (</w:t>
-            </w:r>
-            <w:proofErr w:type="spellStart"/>
-            <w:r>
-              <w:rPr>
-                <w:b/>
-                <w:sz w:val="16"/>
-                <w:lang w:val="ru-RU"/>
-              </w:rPr>
-              <w:t>лб</w:t>
-            </w:r>
-            <w:proofErr w:type="spellEnd"/>
-            <w:r>
-              <w:rPr>
-                <w:b/>
-                <w:sz w:val="16"/>
-                <w:lang w:val="ru-RU"/>
-              </w:rPr>
-              <w:t>)</w:t>
+              <w:t>Б-306 (лб)</w:t>
             </w:r>
           </w:p>
           <w:p>
@@ -534,25 +518,7 @@
                 <w:sz w:val="16"/>
                 <w:lang w:val="ru-RU"/>
               </w:rPr>
-              <w:t>В-105 (</w:t>
-            </w:r>
-            <w:proofErr w:type="spellStart"/>
-            <w:r>
-              <w:rPr>
-                <w:b/>
-                <w:sz w:val="16"/>
-                <w:lang w:val="ru-RU"/>
-              </w:rPr>
-              <w:t>пр</w:t>
-            </w:r>
-            <w:proofErr w:type="spellEnd"/>
-            <w:r>
-              <w:rPr>
-                <w:b/>
-                <w:sz w:val="16"/>
-                <w:lang w:val="ru-RU"/>
-              </w:rPr>
-              <w:t>)</w:t>
+              <w:t>В-105 (пр)</w:t>
             </w:r>
           </w:p>
           <w:p>
@@ -574,48 +540,7 @@
         <w:tc>
           <w:tcPr>
             <w:tcW w:w="1361" w:type="dxa"/>
-            <w:tcMar>
-              <w:top w:w="50" w:type="dxa"/>
-              <w:left w:w="50" w:type="dxa"/>
-              <w:bottom w:w="50" w:type="dxa"/>
-              <w:right w:w="50" w:type="dxa"/>
-            </w:tcMar>
-            <w:vAlign w:val="center"/>
-          </w:tcPr>
-          <w:p>
-            <w:pPr>
-              <w:spacing w:before="60"/>
-              <w:jc w:val="center"/>
-              <w:rPr>
-                <w:lang w:val="ru-RU"/>
-              </w:rPr>
-            </w:pPr>
-          </w:p>
-        </w:tc>
-        <w:tc>
-          <w:tcPr>
-            <w:tcW w:w="1361" w:type="dxa"/>
-            <w:tcMar>
-              <w:top w:w="50" w:type="dxa"/>
-              <w:left w:w="50" w:type="dxa"/>
-              <w:bottom w:w="50" w:type="dxa"/>
-              <w:right w:w="50" w:type="dxa"/>
-            </w:tcMar>
-            <w:vAlign w:val="center"/>
-          </w:tcPr>
-          <w:p>
-            <w:pPr>
-              <w:spacing w:before="60"/>
-              <w:jc w:val="center"/>
-              <w:rPr>
-                <w:lang w:val="ru-RU"/>
-              </w:rPr>
-            </w:pPr>
-          </w:p>
-        </w:tc>
-        <w:tc>
-          <w:tcPr>
-            <w:tcW w:w="1361" w:type="dxa"/>
+            <w:vMerge w:val="restart"/>
             <w:tcMar>
               <w:top w:w="50" w:type="dxa"/>
               <w:left w:w="50" w:type="dxa"/>
@@ -629,17 +554,80 @@
               <w:spacing w:before="60"/>
               <w:jc w:val="center"/>
             </w:pPr>
+            <w:proofErr w:type="spellStart"/>
+            <w:r>
+              <w:rPr>
+                <w:color w:val="888888"/>
+                <w:sz w:val="14"/>
+              </w:rPr>
+              <w:t>Совет</w:t>
+            </w:r>
+            <w:proofErr w:type="spellEnd"/>
           </w:p>
         </w:tc>
         <w:tc>
           <w:tcPr>
             <w:tcW w:w="1361" w:type="dxa"/>
+            <w:vMerge w:val="restart"/>
+            <w:tcMar>
+              <w:top w:w="50" w:type="dxa"/>
+              <w:left w:w="50" w:type="dxa"/>
+              <w:bottom w:w="50" w:type="dxa"/>
+              <w:right w:w="50" w:type="dxa"/>
+            </w:tcMar>
+            <w:vAlign w:val="center"/>
+          </w:tcPr>
+          <w:p>
+            <w:pPr>
+              <w:spacing w:before="60"/>
+              <w:jc w:val="center"/>
+            </w:pPr>
+            <w:r>
+              <w:rPr>
+                <w:color w:val="888888"/>
+                <w:sz w:val="14"/>
+              </w:rPr>
+              <w:t>Совет</w:t>
+            </w:r>
+          </w:p>
+        </w:tc>
+        <w:tc>
+          <w:tcPr>
+            <w:tcW w:w="1361" w:type="dxa"/>
+            <w:vMerge w:val="restart"/>
+            <w:tcMar>
+              <w:top w:w="50" w:type="dxa"/>
+              <w:left w:w="50" w:type="dxa"/>
+              <w:bottom w:w="50" w:type="dxa"/>
+              <w:right w:w="50" w:type="dxa"/>
+            </w:tcMar>
+            <w:vAlign w:val="center"/>
+          </w:tcPr>
+          <w:p>
+            <w:pPr>
+              <w:spacing w:before="60"/>
+              <w:jc w:val="center"/>
+            </w:pPr>
+            <w:r>
+              <w:rPr>
+                <w:color w:val="888888"/>
+                <w:sz w:val="14"/>
+              </w:rPr>
+              <w:t>Совет</w:t>
+            </w:r>
+          </w:p>
+        </w:tc>
+        <w:tc>
+          <w:tcPr>
+            <w:tcW w:w="1361" w:type="dxa"/>
+            <w:vMerge w:val="restart"/>
           </w:tcPr>
           <w:p/>
         </w:tc>
         <w:tc>
           <w:tcPr>
             <w:tcW w:w="1361" w:type="dxa"/>
+            <w:vMerge w:val="restart"/>
           </w:tcPr>
           <w:p/>
         </w:tc>
@@ -694,25 +682,7 @@
                 <w:sz w:val="16"/>
                 <w:lang w:val="ru-RU"/>
               </w:rPr>
-              <w:t>Б-306 (</w:t>
-            </w:r>
-            <w:proofErr w:type="spellStart"/>
-            <w:r>
-              <w:rPr>
-                <w:b/>
-                <w:sz w:val="16"/>
-                <w:lang w:val="ru-RU"/>
-              </w:rPr>
-              <w:t>лб</w:t>
-            </w:r>
-            <w:proofErr w:type="spellEnd"/>
-            <w:r>
-              <w:rPr>
-                <w:b/>
-                <w:sz w:val="16"/>
-                <w:lang w:val="ru-RU"/>
-              </w:rPr>
-              <w:t>)</w:t>
+              <w:t>Б-306 (лб)</w:t>
             </w:r>
           </w:p>
           <w:p>
@@ -785,23 +755,7 @@
                 <w:sz w:val="14"/>
                 <w:lang w:val="ru-RU"/>
               </w:rPr>
-              <w:t>[</w:t>
-            </w:r>
-            <w:proofErr w:type="spellStart"/>
-            <w:r>
-              <w:rPr>
-                <w:sz w:val="14"/>
-                <w:lang w:val="ru-RU"/>
-              </w:rPr>
-              <w:t>30</w:t>
-            </w:r>
-            <w:proofErr w:type="spellEnd"/>
-            <w:r>
-              <w:rPr>
-                <w:sz w:val="14"/>
-                <w:lang w:val="ru-RU"/>
-              </w:rPr>
-              <w:t xml:space="preserve"> чел.] Информационные технологии</w:t>
+              <w:t>[30 чел.] Информационные технологии</w:t>
             </w:r>
           </w:p>
         </w:tc>
@@ -820,6 +774,7 @@
         <w:tc>
           <w:tcPr>
             <w:tcW w:w="1234" w:type="dxa"/>
+            <w:vMerge/>
           </w:tcPr>
           <w:p>
             <w:pPr>
@@ -832,6 +787,7 @@
         <w:tc>
           <w:tcPr>
             <w:tcW w:w="1234" w:type="dxa"/>
+            <w:vMerge/>
           </w:tcPr>
           <w:p>
             <w:pPr>
@@ -844,6 +800,7 @@
         <w:tc>
           <w:tcPr>
             <w:tcW w:w="1234" w:type="dxa"/>
+            <w:vMerge/>
           </w:tcPr>
           <w:p>
             <w:pPr>
@@ -856,6 +813,7 @@
         <w:tc>
           <w:tcPr>
             <w:tcW w:w="1234" w:type="dxa"/>
+            <w:vMerge/>
           </w:tcPr>
           <w:p>
             <w:pPr>
@@ -868,6 +826,7 @@
         <w:tc>
           <w:tcPr>
             <w:tcW w:w="1234" w:type="dxa"/>
+            <w:vMerge/>
           </w:tcPr>
           <w:p>
             <w:pPr>
@@ -1105,6 +1064,7 @@
         <w:tc>
           <w:tcPr>
             <w:tcW w:w="1361" w:type="dxa"/>
+            <w:vMerge w:val="restart"/>
           </w:tcPr>
           <w:p>
             <w:pPr>
@@ -1117,6 +1077,7 @@
         <w:tc>
           <w:tcPr>
             <w:tcW w:w="1361" w:type="dxa"/>
+            <w:vMerge w:val="restart"/>
           </w:tcPr>
           <w:p>
             <w:pPr>
@@ -1129,6 +1090,7 @@
         <w:tc>
           <w:tcPr>
             <w:tcW w:w="1361" w:type="dxa"/>
+            <w:vMerge w:val="restart"/>
           </w:tcPr>
           <w:p>
             <w:pPr>
@@ -1141,6 +1103,7 @@
         <w:tc>
           <w:tcPr>
             <w:tcW w:w="1361" w:type="dxa"/>
+            <w:vMerge w:val="restart"/>
           </w:tcPr>
           <w:p>
             <w:pPr>
@@ -1153,6 +1116,7 @@
         <w:tc>
           <w:tcPr>
             <w:tcW w:w="1361" w:type="dxa"/>
+            <w:vMerge w:val="restart"/>
           </w:tcPr>
           <w:p>
             <w:pPr>
@@ -1347,6 +1311,7 @@
         <w:tc>
           <w:tcPr>
             <w:tcW w:w="1234" w:type="dxa"/>
+            <w:vMerge/>
           </w:tcPr>
           <w:p>
             <w:pPr>
@@ -1359,6 +1324,7 @@
         <w:tc>
           <w:tcPr>
             <w:tcW w:w="1234" w:type="dxa"/>
+            <w:vMerge/>
           </w:tcPr>
           <w:p>
             <w:pPr>
@@ -1371,6 +1337,7 @@
         <w:tc>
           <w:tcPr>
             <w:tcW w:w="1234" w:type="dxa"/>
+            <w:vMerge/>
           </w:tcPr>
           <w:p>
             <w:pPr>
@@ -1383,6 +1350,7 @@
         <w:tc>
           <w:tcPr>
             <w:tcW w:w="1234" w:type="dxa"/>
+            <w:vMerge/>
           </w:tcPr>
           <w:p>
             <w:pPr>
@@ -1395,6 +1363,7 @@
         <w:tc>
           <w:tcPr>
             <w:tcW w:w="1234" w:type="dxa"/>
+            <w:vMerge/>
           </w:tcPr>
           <w:p>
             <w:pPr>
@@ -1432,6 +1401,7 @@
         <w:tc>
           <w:tcPr>
             <w:tcW w:w="1361" w:type="dxa"/>
+            <w:vMerge w:val="restart"/>
             <w:tcMar>
               <w:top w:w="50" w:type="dxa"/>
               <w:left w:w="50" w:type="dxa"/>
@@ -1444,6 +1414,346 @@
             <w:pPr>
               <w:spacing w:before="60"/>
               <w:jc w:val="center"/>
+            </w:pPr>
+            <w:proofErr w:type="spellStart"/>
+            <w:r>
+              <w:rPr>
+                <w:color w:val="888888"/>
+                <w:sz w:val="14"/>
+              </w:rPr>
+              <w:t>Освободить</w:t>
+            </w:r>
+            <w:proofErr w:type="spellEnd"/>
+          </w:p>
+        </w:tc>
+        <w:tc>
+          <w:tcPr>
+            <w:tcW w:w="1361" w:type="dxa"/>
+            <w:vMerge w:val="restart"/>
+            <w:shd w:val="clear" w:color="auto" w:fill="FAFAFA"/>
+            <w:tcMar>
+              <w:top w:w="50" w:type="dxa"/>
+              <w:left w:w="50" w:type="dxa"/>
+              <w:bottom w:w="50" w:type="dxa"/>
+              <w:right w:w="50" w:type="dxa"/>
+            </w:tcMar>
+            <w:vAlign w:val="center"/>
+          </w:tcPr>
+          <w:p>
+            <w:pPr>
+              <w:spacing w:before="60"/>
+              <w:rPr>
+                <w:lang w:val="ru-RU"/>
+              </w:rPr>
+            </w:pPr>
+            <w:r>
+              <w:rPr>
+                <w:sz w:val="16"/>
+                <w:lang w:val="ru-RU"/>
+              </w:rPr>
+              <w:t>МЦб-24-1</w:t>
+            </w:r>
+            <w:r>
+              <w:rPr>
+                <w:sz w:val="16"/>
+                <w:lang w:val="ru-RU"/>
+              </w:rPr>
+              <w:br/>
+            </w:r>
+            <w:r>
+              <w:rPr>
+                <w:b/>
+                <w:sz w:val="16"/>
+                <w:lang w:val="ru-RU"/>
+              </w:rPr>
+              <w:t>В-201 (</w:t>
+            </w:r>
+            <w:proofErr w:type="spellStart"/>
+            <w:r>
+              <w:rPr>
+                <w:b/>
+                <w:sz w:val="16"/>
+                <w:lang w:val="ru-RU"/>
+              </w:rPr>
+              <w:t>пр</w:t>
+            </w:r>
+            <w:proofErr w:type="spellEnd"/>
+            <w:r>
+              <w:rPr>
+                <w:b/>
+                <w:sz w:val="16"/>
+                <w:lang w:val="ru-RU"/>
+              </w:rPr>
+              <w:t>)</w:t>
+            </w:r>
+          </w:p>
+          <w:p>
+            <w:pPr>
+              <w:spacing w:before="60"/>
+              <w:rPr>
+                <w:lang w:val="ru-RU"/>
+              </w:rPr>
+            </w:pPr>
+            <w:r>
+              <w:rPr>
+                <w:sz w:val="14"/>
+                <w:lang w:val="ru-RU"/>
+              </w:rPr>
+              <w:t xml:space="preserve">[24 чел.] Разработка прикладного ПО на языке </w:t>
+            </w:r>
+            <w:r>
+              <w:rPr>
+                <w:sz w:val="14"/>
+              </w:rPr>
+              <w:t>Python</w:t>
+            </w:r>
+          </w:p>
+        </w:tc>
+        <w:tc>
+          <w:tcPr>
+            <w:tcW w:w="1361" w:type="dxa"/>
+            <w:shd w:val="clear" w:color="auto" w:fill="FAFAFA"/>
+            <w:tcMar>
+              <w:top w:w="50" w:type="dxa"/>
+              <w:left w:w="50" w:type="dxa"/>
+              <w:bottom w:w="50" w:type="dxa"/>
+              <w:right w:w="50" w:type="dxa"/>
+            </w:tcMar>
+            <w:vAlign w:val="center"/>
+          </w:tcPr>
+          <w:p>
+            <w:pPr>
+              <w:spacing w:before="60"/>
+              <w:rPr>
+                <w:lang w:val="ru-RU"/>
+              </w:rPr>
+            </w:pPr>
+            <w:r>
+              <w:rPr>
+                <w:sz w:val="16"/>
+                <w:lang w:val="ru-RU"/>
+              </w:rPr>
+              <w:t>УСТб-25-1</w:t>
+            </w:r>
+            <w:r>
+              <w:rPr>
+                <w:sz w:val="16"/>
+                <w:lang w:val="ru-RU"/>
+              </w:rPr>
+              <w:br/>
+            </w:r>
+            <w:r>
+              <w:rPr>
+                <w:b/>
+                <w:sz w:val="16"/>
+                <w:lang w:val="ru-RU"/>
+              </w:rPr>
+              <w:t>В-02 (</w:t>
+            </w:r>
+            <w:proofErr w:type="spellStart"/>
+            <w:r>
+              <w:rPr>
+                <w:b/>
+                <w:sz w:val="16"/>
+                <w:lang w:val="ru-RU"/>
+              </w:rPr>
+              <w:t>лб</w:t>
+            </w:r>
+            <w:proofErr w:type="spellEnd"/>
+            <w:r>
+              <w:rPr>
+                <w:b/>
+                <w:sz w:val="16"/>
+                <w:lang w:val="ru-RU"/>
+              </w:rPr>
+              <w:t>)</w:t>
+            </w:r>
+          </w:p>
+          <w:p>
+            <w:pPr>
+              <w:spacing w:before="60"/>
+              <w:rPr>
+                <w:lang w:val="ru-RU"/>
+              </w:rPr>
+            </w:pPr>
+            <w:r>
+              <w:rPr>
+                <w:sz w:val="14"/>
+                <w:lang w:val="ru-RU"/>
+              </w:rPr>
+              <w:t>[32 чел.] Информационные технологии</w:t>
+            </w:r>
+          </w:p>
+        </w:tc>
+        <w:tc>
+          <w:tcPr>
+            <w:tcW w:w="1361" w:type="dxa"/>
+            <w:shd w:val="clear" w:color="auto" w:fill="FAFAFA"/>
+            <w:tcMar>
+              <w:top w:w="50" w:type="dxa"/>
+              <w:left w:w="50" w:type="dxa"/>
+              <w:bottom w:w="50" w:type="dxa"/>
+              <w:right w:w="50" w:type="dxa"/>
+            </w:tcMar>
+            <w:vAlign w:val="center"/>
+          </w:tcPr>
+          <w:p>
+            <w:pPr>
+              <w:spacing w:before="60"/>
+              <w:rPr>
+                <w:lang w:val="ru-RU"/>
+              </w:rPr>
+            </w:pPr>
+            <w:r>
+              <w:rPr>
+                <w:sz w:val="16"/>
+                <w:lang w:val="ru-RU"/>
+              </w:rPr>
+              <w:t>КНб-25-1</w:t>
+            </w:r>
+            <w:r>
+              <w:rPr>
+                <w:sz w:val="16"/>
+                <w:lang w:val="ru-RU"/>
+              </w:rPr>
+              <w:br/>
+            </w:r>
+            <w:r>
+              <w:rPr>
+                <w:b/>
+                <w:sz w:val="16"/>
+                <w:lang w:val="ru-RU"/>
+              </w:rPr>
+              <w:t>Б-306 (</w:t>
+            </w:r>
+            <w:proofErr w:type="spellStart"/>
+            <w:r>
+              <w:rPr>
+                <w:b/>
+                <w:sz w:val="16"/>
+                <w:lang w:val="ru-RU"/>
+              </w:rPr>
+              <w:t>лб</w:t>
+            </w:r>
+            <w:proofErr w:type="spellEnd"/>
+            <w:r>
+              <w:rPr>
+                <w:b/>
+                <w:sz w:val="16"/>
+                <w:lang w:val="ru-RU"/>
+              </w:rPr>
+              <w:t>)</w:t>
+            </w:r>
+          </w:p>
+          <w:p>
+            <w:pPr>
+              <w:spacing w:before="60"/>
+              <w:rPr>
+                <w:lang w:val="ru-RU"/>
+              </w:rPr>
+            </w:pPr>
+            <w:r>
+              <w:rPr>
+                <w:sz w:val="14"/>
+                <w:lang w:val="ru-RU"/>
+              </w:rPr>
+              <w:t>[26 чел.] Информационные технологии</w:t>
+            </w:r>
+          </w:p>
+        </w:tc>
+        <w:tc>
+          <w:tcPr>
+            <w:tcW w:w="1361" w:type="dxa"/>
+            <w:vMerge w:val="restart"/>
+          </w:tcPr>
+          <w:p>
+            <w:pPr>
+              <w:rPr>
+                <w:lang w:val="ru-RU"/>
+              </w:rPr>
+            </w:pPr>
+          </w:p>
+        </w:tc>
+        <w:tc>
+          <w:tcPr>
+            <w:tcW w:w="1361" w:type="dxa"/>
+            <w:vMerge w:val="restart"/>
+          </w:tcPr>
+          <w:p>
+            <w:pPr>
+              <w:rPr>
+                <w:lang w:val="ru-RU"/>
+              </w:rPr>
+            </w:pPr>
+          </w:p>
+        </w:tc>
+        <w:tc>
+          <w:tcPr>
+            <w:tcW w:w="1361" w:type="dxa"/>
+            <w:vMerge w:val="restart"/>
+          </w:tcPr>
+          <w:p>
+            <w:pPr>
+              <w:rPr>
+                <w:lang w:val="ru-RU"/>
+              </w:rPr>
+            </w:pPr>
+          </w:p>
+        </w:tc>
+        <w:tc>
+          <w:tcPr>
+            <w:tcW w:w="1361" w:type="dxa"/>
+            <w:vMerge w:val="restart"/>
+          </w:tcPr>
+          <w:p>
+            <w:pPr>
+              <w:rPr>
+                <w:lang w:val="ru-RU"/>
+              </w:rPr>
+            </w:pPr>
+          </w:p>
+        </w:tc>
+      </w:tr>
+      <w:tr>
+        <w:trPr>
+          <w:trHeight w:hRule="exact" w:val="1020"/>
+        </w:trPr>
+        <w:tc>
+          <w:tcPr>
+            <w:tcW w:w="1234" w:type="dxa"/>
+            <w:vMerge/>
+          </w:tcPr>
+          <w:p>
+            <w:pPr>
+              <w:rPr>
+                <w:lang w:val="ru-RU"/>
+              </w:rPr>
+            </w:pPr>
+          </w:p>
+        </w:tc>
+        <w:tc>
+          <w:tcPr>
+            <w:tcW w:w="1234" w:type="dxa"/>
+            <w:vMerge/>
+          </w:tcPr>
+          <w:p>
+            <w:pPr>
+              <w:rPr>
+                <w:lang w:val="ru-RU"/>
+              </w:rPr>
+            </w:pPr>
+          </w:p>
+        </w:tc>
+        <w:tc>
+          <w:tcPr>
+            <w:tcW w:w="1234" w:type="dxa"/>
+            <w:vMerge/>
+          </w:tcPr>
+          <w:p>
+            <w:pPr>
+              <w:rPr>
+                <w:lang w:val="ru-RU"/>
+              </w:rPr>
             </w:pPr>
           </w:p>
         </w:tc>
@@ -1471,7 +1781,7 @@
                 <w:sz w:val="16"/>
                 <w:lang w:val="ru-RU"/>
               </w:rPr>
-              <w:t>МЦб-24-1</w:t>
+              <w:t>ЭПб-25-1</w:t>
             </w:r>
             <w:r>
               <w:rPr>
@@ -1486,7 +1796,7 @@
                 <w:sz w:val="16"/>
                 <w:lang w:val="ru-RU"/>
               </w:rPr>
-              <w:t>В-201 (</w:t>
+              <w:t>В-202 (</w:t>
             </w:r>
             <w:proofErr w:type="spellStart"/>
             <w:r>
@@ -1495,7 +1805,7 @@
                 <w:sz w:val="16"/>
                 <w:lang w:val="ru-RU"/>
               </w:rPr>
-              <w:t>пр</w:t>
+              <w:t>лб</w:t>
             </w:r>
             <w:proofErr w:type="spellEnd"/>
             <w:r>
@@ -1519,13 +1829,7 @@
                 <w:sz w:val="14"/>
                 <w:lang w:val="ru-RU"/>
               </w:rPr>
-              <w:t xml:space="preserve">[24 чел.] Разработка прикладного ПО на языке </w:t>
-            </w:r>
-            <w:r>
-              <w:rPr>
-                <w:sz w:val="14"/>
-              </w:rPr>
-              <w:t>Python</w:t>
+              <w:t>[24 чел.] Информационные технологии</w:t>
             </w:r>
           </w:p>
         </w:tc>
@@ -1553,7 +1857,7 @@
                 <w:sz w:val="16"/>
                 <w:lang w:val="ru-RU"/>
               </w:rPr>
-              <w:t>УСТб-25-1</w:t>
+              <w:t>ИСТб-25-3</w:t>
             </w:r>
             <w:r>
               <w:rPr>
@@ -1568,7 +1872,7 @@
                 <w:sz w:val="16"/>
                 <w:lang w:val="ru-RU"/>
               </w:rPr>
-              <w:t>В-02 (</w:t>
+              <w:t>Б-305 (</w:t>
             </w:r>
             <w:proofErr w:type="spellStart"/>
             <w:r>
@@ -1577,7 +1881,7 @@
                 <w:sz w:val="16"/>
                 <w:lang w:val="ru-RU"/>
               </w:rPr>
-              <w:t>лб</w:t>
+              <w:t>пр</w:t>
             </w:r>
             <w:proofErr w:type="spellEnd"/>
             <w:r>
@@ -1601,139 +1905,10 @@
                 <w:sz w:val="14"/>
                 <w:lang w:val="ru-RU"/>
               </w:rPr>
-              <w:t>[32 чел.] Информационные технологии</w:t>
+              <w:t>[15 чел.] Информатика</w:t>
             </w:r>
           </w:p>
         </w:tc>
-        <w:tc>
-          <w:tcPr>
-            <w:tcW w:w="1361" w:type="dxa"/>
-            <w:shd w:val="clear" w:color="auto" w:fill="FAFAFA"/>
-            <w:tcMar>
-              <w:top w:w="50" w:type="dxa"/>
-              <w:left w:w="50" w:type="dxa"/>
-              <w:bottom w:w="50" w:type="dxa"/>
-              <w:right w:w="50" w:type="dxa"/>
-            </w:tcMar>
-            <w:vAlign w:val="center"/>
-          </w:tcPr>
-          <w:p>
-            <w:pPr>
-              <w:spacing w:before="60"/>
-              <w:rPr>
-                <w:lang w:val="ru-RU"/>
-              </w:rPr>
-            </w:pPr>
-            <w:r>
-              <w:rPr>
-                <w:sz w:val="16"/>
-                <w:lang w:val="ru-RU"/>
-              </w:rPr>
-              <w:t>КНб-25-1</w:t>
-            </w:r>
-            <w:r>
-              <w:rPr>
-                <w:sz w:val="16"/>
-                <w:lang w:val="ru-RU"/>
-              </w:rPr>
-              <w:br/>
-            </w:r>
-            <w:r>
-              <w:rPr>
-                <w:b/>
-                <w:sz w:val="16"/>
-                <w:lang w:val="ru-RU"/>
-              </w:rPr>
-              <w:t>Б-306 (</w:t>
-            </w:r>
-            <w:proofErr w:type="spellStart"/>
-            <w:r>
-              <w:rPr>
-                <w:b/>
-                <w:sz w:val="16"/>
-                <w:lang w:val="ru-RU"/>
-              </w:rPr>
-              <w:t>лб</w:t>
-            </w:r>
-            <w:proofErr w:type="spellEnd"/>
-            <w:r>
-              <w:rPr>
-                <w:b/>
-                <w:sz w:val="16"/>
-                <w:lang w:val="ru-RU"/>
-              </w:rPr>
-              <w:t>)</w:t>
-            </w:r>
-          </w:p>
-          <w:p>
-            <w:pPr>
-              <w:spacing w:before="60"/>
-              <w:rPr>
-                <w:lang w:val="ru-RU"/>
-              </w:rPr>
-            </w:pPr>
-            <w:r>
-              <w:rPr>
-                <w:sz w:val="14"/>
-                <w:lang w:val="ru-RU"/>
-              </w:rPr>
-              <w:t>[26 чел.] Информационные технологии</w:t>
-            </w:r>
-          </w:p>
-        </w:tc>
-        <w:tc>
-          <w:tcPr>
-            <w:tcW w:w="1361" w:type="dxa"/>
-          </w:tcPr>
-          <w:p>
-            <w:pPr>
-              <w:rPr>
-                <w:lang w:val="ru-RU"/>
-              </w:rPr>
-            </w:pPr>
-          </w:p>
-        </w:tc>
-        <w:tc>
-          <w:tcPr>
-            <w:tcW w:w="1361" w:type="dxa"/>
-          </w:tcPr>
-          <w:p>
-            <w:pPr>
-              <w:rPr>
-                <w:lang w:val="ru-RU"/>
-              </w:rPr>
-            </w:pPr>
-          </w:p>
-        </w:tc>
-        <w:tc>
-          <w:tcPr>
-            <w:tcW w:w="1361" w:type="dxa"/>
-          </w:tcPr>
-          <w:p>
-            <w:pPr>
-              <w:rPr>
-                <w:lang w:val="ru-RU"/>
-              </w:rPr>
-            </w:pPr>
-          </w:p>
-        </w:tc>
-        <w:tc>
-          <w:tcPr>
-            <w:tcW w:w="1361" w:type="dxa"/>
-          </w:tcPr>
-          <w:p>
-            <w:pPr>
-              <w:rPr>
-                <w:lang w:val="ru-RU"/>
-              </w:rPr>
-            </w:pPr>
-          </w:p>
-        </w:tc>
-      </w:tr>
-      <w:tr>
-        <w:trPr>
-          <w:trHeight w:hRule="exact" w:val="1020"/>
-        </w:trPr>
         <w:tc>
           <w:tcPr>
             <w:tcW w:w="1234" w:type="dxa"/>
@@ -1750,6 +1925,7 @@
         <w:tc>
           <w:tcPr>
             <w:tcW w:w="1234" w:type="dxa"/>
+            <w:vMerge/>
           </w:tcPr>
           <w:p>
             <w:pPr>
@@ -1762,171 +1938,7 @@
         <w:tc>
           <w:tcPr>
             <w:tcW w:w="1234" w:type="dxa"/>
-            <w:shd w:val="clear" w:color="auto" w:fill="FAFAFA"/>
-          </w:tcPr>
-          <w:p>
-            <w:pPr>
-              <w:rPr>
-                <w:lang w:val="ru-RU"/>
-              </w:rPr>
-            </w:pPr>
-          </w:p>
-        </w:tc>
-        <w:tc>
-          <w:tcPr>
-            <w:tcW w:w="1361" w:type="dxa"/>
-            <w:shd w:val="clear" w:color="auto" w:fill="FAFAFA"/>
-            <w:tcMar>
-              <w:top w:w="50" w:type="dxa"/>
-              <w:left w:w="50" w:type="dxa"/>
-              <w:bottom w:w="50" w:type="dxa"/>
-              <w:right w:w="50" w:type="dxa"/>
-            </w:tcMar>
-            <w:vAlign w:val="center"/>
-          </w:tcPr>
-          <w:p>
-            <w:pPr>
-              <w:spacing w:before="60"/>
-              <w:rPr>
-                <w:lang w:val="ru-RU"/>
-              </w:rPr>
-            </w:pPr>
-            <w:r>
-              <w:rPr>
-                <w:sz w:val="16"/>
-                <w:lang w:val="ru-RU"/>
-              </w:rPr>
-              <w:t>ЭПб-25-1</w:t>
-            </w:r>
-            <w:r>
-              <w:rPr>
-                <w:sz w:val="16"/>
-                <w:lang w:val="ru-RU"/>
-              </w:rPr>
-              <w:br/>
-            </w:r>
-            <w:r>
-              <w:rPr>
-                <w:b/>
-                <w:sz w:val="16"/>
-                <w:lang w:val="ru-RU"/>
-              </w:rPr>
-              <w:t>В-202 (</w:t>
-            </w:r>
-            <w:proofErr w:type="spellStart"/>
-            <w:r>
-              <w:rPr>
-                <w:b/>
-                <w:sz w:val="16"/>
-                <w:lang w:val="ru-RU"/>
-              </w:rPr>
-              <w:t>лб</w:t>
-            </w:r>
-            <w:proofErr w:type="spellEnd"/>
-            <w:r>
-              <w:rPr>
-                <w:b/>
-                <w:sz w:val="16"/>
-                <w:lang w:val="ru-RU"/>
-              </w:rPr>
-              <w:t>)</w:t>
-            </w:r>
-          </w:p>
-          <w:p>
-            <w:pPr>
-              <w:spacing w:before="60"/>
-              <w:rPr>
-                <w:lang w:val="ru-RU"/>
-              </w:rPr>
-            </w:pPr>
-            <w:r>
-              <w:rPr>
-                <w:sz w:val="14"/>
-                <w:lang w:val="ru-RU"/>
-              </w:rPr>
-              <w:t>[24 чел.] Информационные технологии</w:t>
-            </w:r>
-          </w:p>
-        </w:tc>
-        <w:tc>
-          <w:tcPr>
-            <w:tcW w:w="1361" w:type="dxa"/>
-            <w:shd w:val="clear" w:color="auto" w:fill="FAFAFA"/>
-            <w:tcMar>
-              <w:top w:w="50" w:type="dxa"/>
-              <w:left w:w="50" w:type="dxa"/>
-              <w:bottom w:w="50" w:type="dxa"/>
-              <w:right w:w="50" w:type="dxa"/>
-            </w:tcMar>
-            <w:vAlign w:val="center"/>
-          </w:tcPr>
-          <w:p>
-            <w:pPr>
-              <w:spacing w:before="60"/>
-              <w:rPr>
-                <w:lang w:val="ru-RU"/>
-              </w:rPr>
-            </w:pPr>
-            <w:r>
-              <w:rPr>
-                <w:sz w:val="16"/>
-                <w:lang w:val="ru-RU"/>
-              </w:rPr>
-              <w:t>ИСТб-25-3</w:t>
-            </w:r>
-            <w:r>
-              <w:rPr>
-                <w:sz w:val="16"/>
-                <w:lang w:val="ru-RU"/>
-              </w:rPr>
-              <w:br/>
-            </w:r>
-            <w:r>
-              <w:rPr>
-                <w:b/>
-                <w:sz w:val="16"/>
-                <w:lang w:val="ru-RU"/>
-              </w:rPr>
-              <w:t>Б-305 (</w:t>
-            </w:r>
-            <w:proofErr w:type="spellStart"/>
-            <w:r>
-              <w:rPr>
-                <w:b/>
-                <w:sz w:val="16"/>
-                <w:lang w:val="ru-RU"/>
-              </w:rPr>
-              <w:t>пр</w:t>
-            </w:r>
-            <w:proofErr w:type="spellEnd"/>
-            <w:r>
-              <w:rPr>
-                <w:b/>
-                <w:sz w:val="16"/>
-                <w:lang w:val="ru-RU"/>
-              </w:rPr>
-              <w:t>)</w:t>
-            </w:r>
-          </w:p>
-          <w:p>
-            <w:pPr>
-              <w:spacing w:before="60"/>
-              <w:rPr>
-                <w:lang w:val="ru-RU"/>
-              </w:rPr>
-            </w:pPr>
-            <w:r>
-              <w:rPr>
-                <w:sz w:val="14"/>
-                <w:lang w:val="ru-RU"/>
-              </w:rPr>
-              <w:t>[15 чел.] Информатика</w:t>
-            </w:r>
-          </w:p>
-        </w:tc>
-        <w:tc>
-          <w:tcPr>
-            <w:tcW w:w="1234" w:type="dxa"/>
+            <w:vMerge/>
           </w:tcPr>
           <w:p>
             <w:pPr>
@@ -1939,30 +1951,7 @@
         <w:tc>
           <w:tcPr>
             <w:tcW w:w="1234" w:type="dxa"/>
-          </w:tcPr>
-          <w:p>
-            <w:pPr>
-              <w:rPr>
-                <w:lang w:val="ru-RU"/>
-              </w:rPr>
-            </w:pPr>
-          </w:p>
-        </w:tc>
-        <w:tc>
-          <w:tcPr>
-            <w:tcW w:w="1234" w:type="dxa"/>
-          </w:tcPr>
-          <w:p>
-            <w:pPr>
-              <w:rPr>
-                <w:lang w:val="ru-RU"/>
-              </w:rPr>
-            </w:pPr>
-          </w:p>
-        </w:tc>
-        <w:tc>
-          <w:tcPr>
-            <w:tcW w:w="1234" w:type="dxa"/>
+            <w:vMerge/>
           </w:tcPr>
           <w:p>
             <w:pPr>
@@ -2000,6 +1989,7 @@
         <w:tc>
           <w:tcPr>
             <w:tcW w:w="1361" w:type="dxa"/>
+            <w:vMerge w:val="restart"/>
             <w:shd w:val="clear" w:color="auto" w:fill="FAFAFA"/>
             <w:tcMar>
               <w:top w:w="50" w:type="dxa"/>
@@ -2076,6 +2066,7 @@
         <w:tc>
           <w:tcPr>
             <w:tcW w:w="1361" w:type="dxa"/>
+            <w:vMerge w:val="restart"/>
             <w:shd w:val="clear" w:color="auto" w:fill="FAFAFA"/>
             <w:tcMar>
               <w:top w:w="50" w:type="dxa"/>
@@ -2152,6 +2143,7 @@
         <w:tc>
           <w:tcPr>
             <w:tcW w:w="1361" w:type="dxa"/>
+            <w:vMerge w:val="restart"/>
           </w:tcPr>
           <w:p>
             <w:pPr>
@@ -2164,6 +2156,7 @@
         <w:tc>
           <w:tcPr>
             <w:tcW w:w="1361" w:type="dxa"/>
+            <w:vMerge w:val="restart"/>
           </w:tcPr>
           <w:p>
             <w:pPr>
@@ -2176,6 +2169,7 @@
         <w:tc>
           <w:tcPr>
             <w:tcW w:w="1361" w:type="dxa"/>
+            <w:vMerge w:val="restart"/>
           </w:tcPr>
           <w:p>
             <w:pPr>
@@ -2188,6 +2182,7 @@
         <w:tc>
           <w:tcPr>
             <w:tcW w:w="1361" w:type="dxa"/>
+            <w:vMerge w:val="restart"/>
           </w:tcPr>
           <w:p>
             <w:pPr>
@@ -2200,6 +2195,7 @@
         <w:tc>
           <w:tcPr>
             <w:tcW w:w="1361" w:type="dxa"/>
+            <w:vMerge w:val="restart"/>
           </w:tcPr>
           <w:p>
             <w:pPr>
@@ -2212,6 +2208,7 @@
         <w:tc>
           <w:tcPr>
             <w:tcW w:w="1361" w:type="dxa"/>
+            <w:vMerge w:val="restart"/>
           </w:tcPr>
           <w:p>
             <w:pPr>
@@ -2242,7 +2239,7 @@
         <w:tc>
           <w:tcPr>
             <w:tcW w:w="1234" w:type="dxa"/>
-            <w:shd w:val="clear" w:color="auto" w:fill="FAFAFA"/>
+            <w:vMerge/>
           </w:tcPr>
           <w:p>
             <w:pPr>
@@ -2255,7 +2252,7 @@
         <w:tc>
           <w:tcPr>
             <w:tcW w:w="1234" w:type="dxa"/>
-            <w:shd w:val="clear" w:color="auto" w:fill="FAFAFA"/>
+            <w:vMerge/>
           </w:tcPr>
           <w:p>
             <w:pPr>
@@ -2268,6 +2265,7 @@
         <w:tc>
           <w:tcPr>
             <w:tcW w:w="1234" w:type="dxa"/>
+            <w:vMerge/>
           </w:tcPr>
           <w:p>
             <w:pPr>
@@ -2280,6 +2278,7 @@
         <w:tc>
           <w:tcPr>
             <w:tcW w:w="1234" w:type="dxa"/>
+            <w:vMerge/>
           </w:tcPr>
           <w:p>
             <w:pPr>
@@ -2292,6 +2291,7 @@
         <w:tc>
           <w:tcPr>
             <w:tcW w:w="1234" w:type="dxa"/>
+            <w:vMerge/>
           </w:tcPr>
           <w:p>
             <w:pPr>
@@ -2304,6 +2304,7 @@
         <w:tc>
           <w:tcPr>
             <w:tcW w:w="1234" w:type="dxa"/>
+            <w:vMerge/>
           </w:tcPr>
           <w:p>
             <w:pPr>
@@ -2316,6 +2317,7 @@
         <w:tc>
           <w:tcPr>
             <w:tcW w:w="1234" w:type="dxa"/>
+            <w:vMerge/>
           </w:tcPr>
           <w:p>
             <w:pPr>
@@ -2328,6 +2330,7 @@
         <w:tc>
           <w:tcPr>
             <w:tcW w:w="1234" w:type="dxa"/>
+            <w:vMerge/>
           </w:tcPr>
           <w:p>
             <w:pPr>
@@ -2593,6 +2596,7 @@
         <w:tc>
           <w:tcPr>
             <w:tcW w:w="1361" w:type="dxa"/>
+            <w:vMerge w:val="restart"/>
           </w:tcPr>
           <w:p>
             <w:pPr>
@@ -2605,6 +2609,7 @@
         <w:tc>
           <w:tcPr>
             <w:tcW w:w="1361" w:type="dxa"/>
+            <w:vMerge w:val="restart"/>
           </w:tcPr>
           <w:p>
             <w:pPr>
@@ -2617,6 +2622,7 @@
         <w:tc>
           <w:tcPr>
             <w:tcW w:w="1361" w:type="dxa"/>
+            <w:vMerge w:val="restart"/>
           </w:tcPr>
           <w:p>
             <w:pPr>
@@ -2629,6 +2635,7 @@
         <w:tc>
           <w:tcPr>
             <w:tcW w:w="1361" w:type="dxa"/>
+            <w:vMerge w:val="restart"/>
           </w:tcPr>
           <w:p>
             <w:pPr>
@@ -2641,6 +2648,7 @@
         <w:tc>
           <w:tcPr>
             <w:tcW w:w="1361" w:type="dxa"/>
+            <w:vMerge w:val="restart"/>
           </w:tcPr>
           <w:p>
             <w:pPr>
@@ -2850,6 +2858,7 @@
         <w:tc>
           <w:tcPr>
             <w:tcW w:w="1234" w:type="dxa"/>
+            <w:vMerge/>
           </w:tcPr>
           <w:p>
             <w:pPr>
@@ -2862,6 +2871,7 @@
         <w:tc>
           <w:tcPr>
             <w:tcW w:w="1234" w:type="dxa"/>
+            <w:vMerge/>
           </w:tcPr>
           <w:p>
             <w:pPr>
@@ -2874,6 +2884,7 @@
         <w:tc>
           <w:tcPr>
             <w:tcW w:w="1234" w:type="dxa"/>
+            <w:vMerge/>
           </w:tcPr>
           <w:p>
             <w:pPr>
@@ -2886,6 +2897,7 @@
         <w:tc>
           <w:tcPr>
             <w:tcW w:w="1234" w:type="dxa"/>
+            <w:vMerge/>
           </w:tcPr>
           <w:p>
             <w:pPr>
@@ -2898,6 +2910,7 @@
         <w:tc>
           <w:tcPr>
             <w:tcW w:w="1234" w:type="dxa"/>
+            <w:vMerge/>
           </w:tcPr>
           <w:p>
             <w:pPr>
@@ -2935,6 +2948,7 @@
         <w:tc>
           <w:tcPr>
             <w:tcW w:w="1361" w:type="dxa"/>
+            <w:vMerge w:val="restart"/>
             <w:tcMar>
               <w:top w:w="50" w:type="dxa"/>
               <w:left w:w="50" w:type="dxa"/>
@@ -2948,11 +2962,21 @@
               <w:spacing w:before="60"/>
               <w:jc w:val="center"/>
             </w:pPr>
+            <w:proofErr w:type="spellStart"/>
+            <w:r>
+              <w:rPr>
+                <w:color w:val="888888"/>
+                <w:sz w:val="14"/>
+              </w:rPr>
+              <w:t>Освободить</w:t>
+            </w:r>
+            <w:proofErr w:type="spellEnd"/>
           </w:p>
         </w:tc>
         <w:tc>
           <w:tcPr>
             <w:tcW w:w="1361" w:type="dxa"/>
+            <w:vMerge w:val="restart"/>
             <w:tcMar>
               <w:top w:w="50" w:type="dxa"/>
               <w:left w:w="50" w:type="dxa"/>
@@ -2966,11 +2990,21 @@
               <w:spacing w:before="60"/>
               <w:jc w:val="center"/>
             </w:pPr>
+            <w:proofErr w:type="spellStart"/>
+            <w:r>
+              <w:rPr>
+                <w:color w:val="888888"/>
+                <w:sz w:val="14"/>
+              </w:rPr>
+              <w:t>Освободить</w:t>
+            </w:r>
+            <w:proofErr w:type="spellEnd"/>
           </w:p>
         </w:tc>
         <w:tc>
           <w:tcPr>
             <w:tcW w:w="1361" w:type="dxa"/>
+            <w:vMerge w:val="restart"/>
             <w:tcMar>
               <w:top w:w="50" w:type="dxa"/>
               <w:left w:w="50" w:type="dxa"/>
@@ -2984,11 +3018,21 @@
               <w:spacing w:before="60"/>
               <w:jc w:val="center"/>
             </w:pPr>
+            <w:proofErr w:type="spellStart"/>
+            <w:r>
+              <w:rPr>
+                <w:color w:val="888888"/>
+                <w:sz w:val="14"/>
+              </w:rPr>
+              <w:t>Освободить</w:t>
+            </w:r>
+            <w:proofErr w:type="spellEnd"/>
           </w:p>
         </w:tc>
         <w:tc>
           <w:tcPr>
             <w:tcW w:w="1361" w:type="dxa"/>
+            <w:vMerge w:val="restart"/>
             <w:tcMar>
               <w:top w:w="50" w:type="dxa"/>
               <w:left w:w="50" w:type="dxa"/>
@@ -3002,34 +3046,21 @@
               <w:spacing w:before="60"/>
               <w:jc w:val="center"/>
             </w:pPr>
+            <w:proofErr w:type="spellStart"/>
+            <w:r>
+              <w:rPr>
+                <w:color w:val="888888"/>
+                <w:sz w:val="14"/>
+              </w:rPr>
+              <w:t>Освободить</w:t>
+            </w:r>
+            <w:proofErr w:type="spellEnd"/>
           </w:p>
         </w:tc>
         <w:tc>
           <w:tcPr>
             <w:tcW w:w="1361" w:type="dxa"/>
-            <w:tcMar>
-              <w:top w:w="50" w:type="dxa"/>
-              <w:left w:w="50" w:type="dxa"/>
-              <w:bottom w:w="50" w:type="dxa"/>
-              <w:right w:w="50" w:type="dxa"/>
-            </w:tcMar>
-            <w:vAlign w:val="center"/>
-          </w:tcPr>
-          <w:p>
-            <w:pPr>
-              <w:spacing w:before="60"/>
-              <w:jc w:val="center"/>
-              <w:rPr>
-                <w:color w:val="888888"/>
-                <w:sz w:val="14"/>
-                <w:lang w:val="ru-RU"/>
-              </w:rPr>
-            </w:pPr>
-          </w:p>
-        </w:tc>
-        <w:tc>
-          <w:tcPr>
-            <w:tcW w:w="1361" w:type="dxa"/>
+            <w:vMerge w:val="restart"/>
             <w:tcMar>
               <w:top w:w="50" w:type="dxa"/>
               <w:left w:w="50" w:type="dxa"/>
@@ -3043,11 +3074,21 @@
               <w:spacing w:before="60"/>
               <w:jc w:val="center"/>
             </w:pPr>
+            <w:proofErr w:type="spellStart"/>
+            <w:r>
+              <w:rPr>
+                <w:color w:val="888888"/>
+                <w:sz w:val="14"/>
+              </w:rPr>
+              <w:t>Освободить</w:t>
+            </w:r>
+            <w:proofErr w:type="spellEnd"/>
           </w:p>
         </w:tc>
         <w:tc>
           <w:tcPr>
             <w:tcW w:w="1361" w:type="dxa"/>
+            <w:vMerge w:val="restart"/>
             <w:tcMar>
               <w:top w:w="50" w:type="dxa"/>
               <w:left w:w="50" w:type="dxa"/>
@@ -3061,11 +3102,21 @@
               <w:spacing w:before="60"/>
               <w:jc w:val="center"/>
             </w:pPr>
+            <w:proofErr w:type="spellStart"/>
+            <w:r>
+              <w:rPr>
+                <w:color w:val="888888"/>
+                <w:sz w:val="14"/>
+              </w:rPr>
+              <w:t>Освободить</w:t>
+            </w:r>
+            <w:proofErr w:type="spellEnd"/>
           </w:p>
         </w:tc>
         <w:tc>
           <w:tcPr>
             <w:tcW w:w="1361" w:type="dxa"/>
+            <w:vMerge w:val="restart"/>
             <w:tcMar>
               <w:top w:w="50" w:type="dxa"/>
               <w:left w:w="50" w:type="dxa"/>
@@ -3079,6 +3130,43 @@
               <w:spacing w:before="60"/>
               <w:jc w:val="center"/>
             </w:pPr>
+            <w:proofErr w:type="spellStart"/>
+            <w:r>
+              <w:rPr>
+                <w:color w:val="888888"/>
+                <w:sz w:val="14"/>
+              </w:rPr>
+              <w:t>Освободить</w:t>
+            </w:r>
+            <w:proofErr w:type="spellEnd"/>
+          </w:p>
+        </w:tc>
+        <w:tc>
+          <w:tcPr>
+            <w:tcW w:w="1361" w:type="dxa"/>
+            <w:vMerge w:val="restart"/>
+            <w:tcMar>
+              <w:top w:w="50" w:type="dxa"/>
+              <w:left w:w="50" w:type="dxa"/>
+              <w:bottom w:w="50" w:type="dxa"/>
+              <w:right w:w="50" w:type="dxa"/>
+            </w:tcMar>
+            <w:vAlign w:val="center"/>
+          </w:tcPr>
+          <w:p>
+            <w:pPr>
+              <w:spacing w:before="60"/>
+              <w:jc w:val="center"/>
+            </w:pPr>
+            <w:proofErr w:type="spellStart"/>
+            <w:r>
+              <w:rPr>
+                <w:color w:val="888888"/>
+                <w:sz w:val="14"/>
+              </w:rPr>
+              <w:t>Освободить</w:t>
+            </w:r>
+            <w:proofErr w:type="spellEnd"/>
           </w:p>
         </w:tc>
       </w:tr>
@@ -3096,48 +3184,56 @@
         <w:tc>
           <w:tcPr>
             <w:tcW w:w="1234" w:type="dxa"/>
+            <w:vMerge/>
           </w:tcPr>
           <w:p/>
         </w:tc>
         <w:tc>
           <w:tcPr>
             <w:tcW w:w="1234" w:type="dxa"/>
+            <w:vMerge/>
           </w:tcPr>
           <w:p/>
         </w:tc>
         <w:tc>
           <w:tcPr>
             <w:tcW w:w="1234" w:type="dxa"/>
+            <w:vMerge/>
           </w:tcPr>
           <w:p/>
         </w:tc>
         <w:tc>
           <w:tcPr>
             <w:tcW w:w="1234" w:type="dxa"/>
+            <w:vMerge/>
           </w:tcPr>
           <w:p/>
         </w:tc>
         <w:tc>
           <w:tcPr>
             <w:tcW w:w="1234" w:type="dxa"/>
+            <w:vMerge/>
           </w:tcPr>
           <w:p/>
         </w:tc>
         <w:tc>
           <w:tcPr>
             <w:tcW w:w="1234" w:type="dxa"/>
+            <w:vMerge/>
           </w:tcPr>
           <w:p/>
         </w:tc>
         <w:tc>
           <w:tcPr>
             <w:tcW w:w="1234" w:type="dxa"/>
+            <w:vMerge/>
           </w:tcPr>
           <w:p/>
         </w:tc>
         <w:tc>
           <w:tcPr>
             <w:tcW w:w="1234" w:type="dxa"/>
+            <w:vMerge/>
           </w:tcPr>
           <w:p/>
         </w:tc>

</xml_diff>